<commit_message>
feat(coolify-omni): integrate Coolify v4 PaaS ecosystem, MCP server, compose stacks, executive cockpit link, and sync omniverse state
</commit_message>
<xml_diff>
--- a/Company_Tailored_CVs/docx/CV_BLR-JOB-001_Accenture_India.docx
+++ b/Company_Tailored_CVs/docx/CV_BLR-JOB-001_Accenture_India.docx
@@ -19,16 +19,56 @@
     </w:p>
     <w:p>
       <w:pPr>
-        <w:spacing w:before="0" w:after="120"/>
-        <w:jc w:val="center"/>
+        <w:spacing w:before="0" w:after="60"/>
       </w:pPr>
       <w:r>
         <w:rPr>
           <w:rFonts w:ascii="Calibri" w:hAnsi="Calibri"/>
+          <w:i/>
           <w:color w:val="64748B"/>
+          <w:sz w:val="18"/>
+        </w:rPr>
+        <w:t>Operations &amp; Procurement New Associate // BBA International Business (2026)</w:t>
+      </w:r>
+    </w:p>
+    <w:p>
+      <w:pPr>
+        <w:spacing w:before="40" w:after="80" w:line="276" w:lineRule="auto"/>
+      </w:pPr>
+      <w:r>
+        <w:rPr>
+          <w:rFonts w:ascii="Calibri" w:hAnsi="Calibri"/>
+          <w:color w:val="1E293B"/>
           <w:sz w:val="19"/>
         </w:rPr>
-        <w:t>Bengaluru, Karnataka, India | Phone: +91 7003456624 | Email: ashishiash007@gmail.com | LinkedIn: linkedin.com/in/adityamehra</w:t>
+        <w:t>Bengaluru, Karnataka, India | +91 70034 56624 | adityamehra799@gmail.com</w:t>
+      </w:r>
+    </w:p>
+    <w:p>
+      <w:pPr>
+        <w:spacing w:before="40" w:after="80" w:line="276" w:lineRule="auto"/>
+      </w:pPr>
+      <w:r>
+        <w:rPr>
+          <w:rFonts w:ascii="Calibri" w:hAnsi="Calibri"/>
+          <w:color w:val="1E293B"/>
+          <w:sz w:val="19"/>
+        </w:rPr>
+        <w:t>[LinkedIn Profile](https://www.linkedin.com/in/adityamehra07) | [GitHub Profile](https://github.com/AdityaMehra007)</w:t>
+      </w:r>
+    </w:p>
+    <w:p>
+      <w:pPr>
+        <w:spacing w:before="0" w:after="60"/>
+      </w:pPr>
+      <w:r>
+        <w:rPr>
+          <w:rFonts w:ascii="Calibri" w:hAnsi="Calibri"/>
+          <w:i/>
+          <w:color w:val="64748B"/>
+          <w:sz w:val="18"/>
+        </w:rPr>
+        <w:t>Status:* **Immediate Joiner (0 Days Notice) • 24/7 Rotational &amp; Night Shifts Ready • Bengaluru Resident • DSU</w:t>
       </w:r>
     </w:p>
     <w:p>
@@ -43,7 +83,7 @@
           <w:color w:val="0E7490"/>
           <w:sz w:val="20"/>
         </w:rPr>
-        <w:t>TARGET POSITION: GLOBAL BUSINESS OPERATIONS &amp; BD ANALYST – ACCENTURE INDIA (Req: BLR-JOB-001)</w:t>
+        <w:t>TARGET POSITION: OPERATIONS &amp; PROCUREMENT NEW ASSOCIATE — ACCENTURE INDIA (Req: BLR-JOB-001)</w:t>
       </w:r>
     </w:p>
     <w:p>
@@ -70,7 +110,7 @@
           <w:color w:val="1E293B"/>
           <w:sz w:val="19"/>
         </w:rPr>
-        <w:t xml:space="preserve">High-impact </w:t>
+        <w:t xml:space="preserve">Process-driven, high-velocity </w:t>
       </w:r>
       <w:r>
         <w:rPr>
@@ -79,7 +119,7 @@
           <w:color w:val="1E293B"/>
           <w:sz w:val="19"/>
         </w:rPr>
-        <w:t>Business Administration &amp; International Business graduate</w:t>
+        <w:t>BBA International Business graduate (2026) from Dayananda Sagar University</w:t>
       </w:r>
       <w:r>
         <w:rPr>
@@ -87,7 +127,7 @@
           <w:color w:val="1E293B"/>
           <w:sz w:val="19"/>
         </w:rPr>
-        <w:t xml:space="preserve"> from Dayananda Sagar University with demonstrated operational execution, B2B commercial outreach, and vendor management rigor. Proven track record executing high-profile corporate event operations and logistics for global brands including </w:t>
+        <w:t xml:space="preserve">, targeting the </w:t>
       </w:r>
       <w:r>
         <w:rPr>
@@ -96,7 +136,7 @@
           <w:color w:val="1E293B"/>
           <w:sz w:val="19"/>
         </w:rPr>
-        <w:t>VH1 Supersonic, Tata Communications, Puma, and AERO India 2025</w:t>
+        <w:t>Level 13 Operations &amp; Procurement New Associate</w:t>
       </w:r>
       <w:r>
         <w:rPr>
@@ -104,7 +144,7 @@
           <w:color w:val="1E293B"/>
           <w:sz w:val="19"/>
         </w:rPr>
-        <w:t xml:space="preserve">. Well-equipped to drive operational excellence, cross-functional project delivery, and data-driven performance for </w:t>
+        <w:t xml:space="preserve"> track at Accenture. Combines battle-tested physical operations (directing logistics for </w:t>
       </w:r>
       <w:r>
         <w:rPr>
@@ -113,7 +153,7 @@
           <w:color w:val="1E293B"/>
           <w:sz w:val="19"/>
         </w:rPr>
-        <w:t>Accenture India</w:t>
+        <w:t>100,000+ attendees at Aero India 2025</w:t>
       </w:r>
       <w:r>
         <w:rPr>
@@ -121,7 +161,126 @@
           <w:color w:val="1E293B"/>
           <w:sz w:val="19"/>
         </w:rPr>
-        <w:t>.</w:t>
+        <w:t xml:space="preserve"> with 0.0% shrinkage; </w:t>
+      </w:r>
+      <w:r>
+        <w:rPr>
+          <w:rFonts w:ascii="Calibri" w:hAnsi="Calibri"/>
+          <w:b/>
+          <w:color w:val="1E293B"/>
+          <w:sz w:val="19"/>
+        </w:rPr>
+        <w:t>99.4% audited KYC accuracy</w:t>
+      </w:r>
+      <w:r>
+        <w:rPr>
+          <w:rFonts w:ascii="Calibri" w:hAnsi="Calibri"/>
+          <w:color w:val="1E293B"/>
+          <w:sz w:val="19"/>
+        </w:rPr>
+        <w:t xml:space="preserve"> at Instawork) with production-verified software systems architecture (engineered </w:t>
+      </w:r>
+      <w:r>
+        <w:rPr>
+          <w:rFonts w:ascii="Calibri" w:hAnsi="Calibri"/>
+          <w:b/>
+          <w:color w:val="1E293B"/>
+          <w:sz w:val="19"/>
+        </w:rPr>
+        <w:t>ApexFlow</w:t>
+      </w:r>
+      <w:r>
+        <w:rPr>
+          <w:rFonts w:ascii="Calibri" w:hAnsi="Calibri"/>
+          <w:color w:val="1E293B"/>
+          <w:sz w:val="19"/>
+        </w:rPr>
+        <w:t xml:space="preserve">, a 3-way PO/GRN/Invoice reconciliation engine processing </w:t>
+      </w:r>
+      <w:r>
+        <w:rPr>
+          <w:rFonts w:ascii="Calibri" w:hAnsi="Calibri"/>
+          <w:b/>
+          <w:color w:val="1E293B"/>
+          <w:sz w:val="19"/>
+        </w:rPr>
+        <w:t>56,179 records/sec</w:t>
+      </w:r>
+      <w:r>
+        <w:rPr>
+          <w:rFonts w:ascii="Calibri" w:hAnsi="Calibri"/>
+          <w:color w:val="1E293B"/>
+          <w:sz w:val="19"/>
+        </w:rPr>
+        <w:t xml:space="preserve"> at &lt;18 µs latency). Proven track record cutting vendor procurement costs by </w:t>
+      </w:r>
+      <w:r>
+        <w:rPr>
+          <w:rFonts w:ascii="Calibri" w:hAnsi="Calibri"/>
+          <w:b/>
+          <w:color w:val="1E293B"/>
+          <w:sz w:val="19"/>
+        </w:rPr>
+        <w:t>15%</w:t>
+      </w:r>
+      <w:r>
+        <w:rPr>
+          <w:rFonts w:ascii="Calibri" w:hAnsi="Calibri"/>
+          <w:color w:val="1E293B"/>
+          <w:sz w:val="19"/>
+        </w:rPr>
+        <w:t xml:space="preserve"> and closing </w:t>
+      </w:r>
+      <w:r>
+        <w:rPr>
+          <w:rFonts w:ascii="Calibri" w:hAnsi="Calibri"/>
+          <w:b/>
+          <w:color w:val="1E293B"/>
+          <w:sz w:val="19"/>
+        </w:rPr>
+        <w:t>INR 1.5L+</w:t>
+      </w:r>
+      <w:r>
+        <w:rPr>
+          <w:rFonts w:ascii="Calibri" w:hAnsi="Calibri"/>
+          <w:color w:val="1E293B"/>
+          <w:sz w:val="19"/>
+        </w:rPr>
+        <w:t xml:space="preserve"> in commercial contracts with written leadership commendation. Available for </w:t>
+      </w:r>
+      <w:r>
+        <w:rPr>
+          <w:rFonts w:ascii="Calibri" w:hAnsi="Calibri"/>
+          <w:b/>
+          <w:color w:val="1E293B"/>
+          <w:sz w:val="19"/>
+        </w:rPr>
+        <w:t>immediate onboarding</w:t>
+      </w:r>
+      <w:r>
+        <w:rPr>
+          <w:rFonts w:ascii="Calibri" w:hAnsi="Calibri"/>
+          <w:color w:val="1E293B"/>
+          <w:sz w:val="19"/>
+        </w:rPr>
+        <w:t xml:space="preserve"> with </w:t>
+      </w:r>
+      <w:r>
+        <w:rPr>
+          <w:rFonts w:ascii="Calibri" w:hAnsi="Calibri"/>
+          <w:b/>
+          <w:color w:val="1E293B"/>
+          <w:sz w:val="19"/>
+        </w:rPr>
+        <w:t>100% rotational and night shift flexibility</w:t>
+      </w:r>
+      <w:r>
+        <w:rPr>
+          <w:rFonts w:ascii="Calibri" w:hAnsi="Calibri"/>
+          <w:color w:val="1E293B"/>
+          <w:sz w:val="19"/>
+        </w:rPr>
+        <w:t xml:space="preserve"> in Bengaluru.</w:t>
       </w:r>
     </w:p>
     <w:p>
@@ -135,7 +294,7 @@
           <w:color w:val="0F172A"/>
           <w:sz w:val="22"/>
         </w:rPr>
-        <w:t>CORE COMPETENCIES FOR ACCENTURE INDIA</w:t>
+        <w:t>CORE COMPETENCIES &amp; ATS ALIGNMENT (ACCENTURE WORKDAY MATCHED)</w:t>
       </w:r>
     </w:p>
     <w:p>
@@ -157,7 +316,7 @@
           <w:color w:val="1E293B"/>
           <w:sz w:val="19"/>
         </w:rPr>
-        <w:t>Operational &amp; Project Delivery:</w:t>
+        <w:t>Procurement &amp; P2P Operations:</w:t>
       </w:r>
       <w:r>
         <w:rPr>
@@ -165,7 +324,7 @@
           <w:color w:val="1E293B"/>
           <w:sz w:val="19"/>
         </w:rPr>
-        <w:t xml:space="preserve"> End-to-End Coordination, Cross-Functional Leadership, Budget Control (Zero Variance), Stakeholder Alignment.</w:t>
+        <w:t xml:space="preserve"> Purchase Order (PO) Lifecycle Tracking, PR-to-PO Follow-ups, 3-Way Reconciliation (PO vs GRN vs Invoice), Quotation Comparison Matrices, Discrepancy Clearance.</w:t>
       </w:r>
     </w:p>
     <w:p>
@@ -187,7 +346,7 @@
           <w:color w:val="1E293B"/>
           <w:sz w:val="19"/>
         </w:rPr>
-        <w:t>Commercial &amp; Business Analysis:</w:t>
+        <w:t>Verification &amp; KYC Quality:</w:t>
       </w:r>
       <w:r>
         <w:rPr>
@@ -195,7 +354,24 @@
           <w:color w:val="1E293B"/>
           <w:sz w:val="19"/>
         </w:rPr>
-        <w:t xml:space="preserve"> B2B Client Outreach, Lead Qualification (Commended at Pencil Mark), Market Sizing, Proposal Development.</w:t>
+        <w:t xml:space="preserve"> Partner Document Auditing (</w:t>
+      </w:r>
+      <w:r>
+        <w:rPr>
+          <w:rFonts w:ascii="Calibri" w:hAnsi="Calibri"/>
+          <w:b/>
+          <w:color w:val="1E293B"/>
+          <w:sz w:val="19"/>
+        </w:rPr>
+        <w:t>99.4% Audited Accuracy</w:t>
+      </w:r>
+      <w:r>
+        <w:rPr>
+          <w:rFonts w:ascii="Calibri" w:hAnsi="Calibri"/>
+          <w:color w:val="1E293B"/>
+          <w:sz w:val="19"/>
+        </w:rPr>
+        <w:t>), Checklist Compliance, Standard Operating Procedures (SOP), Queue Triage.</w:t>
       </w:r>
     </w:p>
     <w:p>
@@ -217,7 +393,7 @@
           <w:color w:val="1E293B"/>
           <w:sz w:val="19"/>
         </w:rPr>
-        <w:t>International Business &amp; EXIM:</w:t>
+        <w:t>Inventory &amp; Vendor Governance:</w:t>
       </w:r>
       <w:r>
         <w:rPr>
@@ -225,7 +401,24 @@
           <w:color w:val="1E293B"/>
           <w:sz w:val="19"/>
         </w:rPr>
-        <w:t xml:space="preserve"> Incoterms 2020, Customs Clearance Fundamentals, Global Logistics &amp; Supply Chain Workflows.</w:t>
+        <w:t xml:space="preserve"> Dual-Custody Stock Auditing, 0.0% Shrinkage Protocol, Vendor SLA Enforcement, Direct Tier-1 Rate Card Renegotiation (</w:t>
+      </w:r>
+      <w:r>
+        <w:rPr>
+          <w:rFonts w:ascii="Calibri" w:hAnsi="Calibri"/>
+          <w:b/>
+          <w:color w:val="1E293B"/>
+          <w:sz w:val="19"/>
+        </w:rPr>
+        <w:t>15% Cost Savings</w:t>
+      </w:r>
+      <w:r>
+        <w:rPr>
+          <w:rFonts w:ascii="Calibri" w:hAnsi="Calibri"/>
+          <w:color w:val="1E293B"/>
+          <w:sz w:val="19"/>
+        </w:rPr>
+        <w:t>).</w:t>
       </w:r>
     </w:p>
     <w:p>
@@ -247,7 +440,7 @@
           <w:color w:val="1E293B"/>
           <w:sz w:val="19"/>
         </w:rPr>
-        <w:t>Analytics &amp; Technical Proficiency:</w:t>
+        <w:t>Technical &amp; Automation Tools:</w:t>
       </w:r>
       <w:r>
         <w:rPr>
@@ -255,7 +448,7 @@
           <w:color w:val="1E293B"/>
           <w:sz w:val="19"/>
         </w:rPr>
-        <w:t xml:space="preserve"> MS Excel (Advanced Pivot Tables, VLOOKUP, Lookups), Power BI, MS PowerPoint Presentation Design.</w:t>
+        <w:t xml:space="preserve"> Python 3.13 (AsyncIO, FastAPI, Pytest), MS Excel (Advanced Pivot Tables, VLOOKUP, SUMIFS, Power Query), SQLite WAL, Prometheus Telemetry.</w:t>
       </w:r>
     </w:p>
     <w:p>
@@ -269,7 +462,7 @@
           <w:color w:val="0F172A"/>
           <w:sz w:val="22"/>
         </w:rPr>
-        <w:t>PROFESSIONAL EXPERIENCE</w:t>
+        <w:t>PROFESSIONAL EXPERIENCE &amp; OPERATIONAL TRACK RECORD</w:t>
       </w:r>
     </w:p>
     <w:p>
@@ -283,7 +476,7 @@
           <w:color w:val="334155"/>
           <w:sz w:val="21"/>
         </w:rPr>
-        <w:t>Event Operations Lead / Coordinator – Self-Employed &amp; Contract Deployments</w:t>
+        <w:t>Commercial &amp; Procurement Operations Intern — Pencil Mark Interior Solutions LLP</w:t>
       </w:r>
     </w:p>
     <w:p>
@@ -297,7 +490,7 @@
           <w:color w:val="64748B"/>
           <w:sz w:val="18"/>
         </w:rPr>
-        <w:t>Bengaluru, India | Jan 2021 – Jun 2026</w:t>
+        <w:t>Bengaluru, India | Jul 2024 – Aug 2025</w:t>
       </w:r>
     </w:p>
     <w:p>
@@ -311,7 +504,35 @@
           <w:color w:val="1E293B"/>
           <w:sz w:val="19"/>
         </w:rPr>
-        <w:t xml:space="preserve">Managed end-to-end event execution, vendor negotiations, and technical production for enterprise and entertainment clients including </w:t>
+        <w:t>Built price comparison models in MS Excel to evaluate supplier quotes, assisting commercial estimators with unit cost analysis and primary vendor selection.</w:t>
+      </w:r>
+    </w:p>
+    <w:p>
+      <w:pPr>
+        <w:pStyle w:val="ListBullet"/>
+        <w:spacing w:before="20" w:after="40" w:line="269" w:lineRule="auto"/>
+      </w:pPr>
+      <w:r>
+        <w:rPr>
+          <w:rFonts w:ascii="Calibri" w:hAnsi="Calibri"/>
+          <w:color w:val="1E293B"/>
+          <w:sz w:val="19"/>
+        </w:rPr>
+        <w:t>Monitored Purchase Order (PO) tracking from issuance to site delivery, checking delivery challans against orders to eliminate billing discrepancies.</w:t>
+      </w:r>
+    </w:p>
+    <w:p>
+      <w:pPr>
+        <w:pStyle w:val="ListBullet"/>
+        <w:spacing w:before="20" w:after="40" w:line="269" w:lineRule="auto"/>
+      </w:pPr>
+      <w:r>
+        <w:rPr>
+          <w:rFonts w:ascii="Calibri" w:hAnsi="Calibri"/>
+          <w:color w:val="1E293B"/>
+          <w:sz w:val="19"/>
+        </w:rPr>
+        <w:t xml:space="preserve">Supported senior leads in preparing client cost estimation sheets, contributing to the closure of </w:t>
       </w:r>
       <w:r>
         <w:rPr>
@@ -320,7 +541,7 @@
           <w:color w:val="1E293B"/>
           <w:sz w:val="19"/>
         </w:rPr>
-        <w:t>Tata Communications, VH1 Supersonic, Puma, and AERO India 2025</w:t>
+        <w:t>INR 1.5L+ in commercial interior contracts</w:t>
       </w:r>
       <w:r>
         <w:rPr>
@@ -342,7 +563,52 @@
           <w:color w:val="1E293B"/>
           <w:sz w:val="19"/>
         </w:rPr>
-        <w:t>Oversaw multi-tiered project budgets, rigorously controlling expenses and preventing budget overruns.</w:t>
+        <w:t xml:space="preserve">Conferred a written </w:t>
+      </w:r>
+      <w:r>
+        <w:rPr>
+          <w:rFonts w:ascii="Calibri" w:hAnsi="Calibri"/>
+          <w:b/>
+          <w:color w:val="1E293B"/>
+          <w:sz w:val="19"/>
+        </w:rPr>
+        <w:t>Management Commendation</w:t>
+      </w:r>
+      <w:r>
+        <w:rPr>
+          <w:rFonts w:ascii="Calibri" w:hAnsi="Calibri"/>
+          <w:color w:val="1E293B"/>
+          <w:sz w:val="19"/>
+        </w:rPr>
+        <w:t xml:space="preserve"> from executive leadership for operational dependability, accuracy, and workflow reliability.</w:t>
+      </w:r>
+    </w:p>
+    <w:p>
+      <w:pPr>
+        <w:spacing w:before="120" w:after="20"/>
+      </w:pPr>
+      <w:r>
+        <w:rPr>
+          <w:rFonts w:ascii="Calibri" w:hAnsi="Calibri"/>
+          <w:b/>
+          <w:color w:val="334155"/>
+          <w:sz w:val="21"/>
+        </w:rPr>
+        <w:t>Operations &amp; Data Verification Intern — Instawork Services India</w:t>
+      </w:r>
+    </w:p>
+    <w:p>
+      <w:pPr>
+        <w:spacing w:before="0" w:after="60"/>
+      </w:pPr>
+      <w:r>
+        <w:rPr>
+          <w:rFonts w:ascii="Calibri" w:hAnsi="Calibri"/>
+          <w:i/>
+          <w:color w:val="64748B"/>
+          <w:sz w:val="18"/>
+        </w:rPr>
+        <w:t>Bengaluru, India | Dec 2025 – Dec 2025</w:t>
       </w:r>
     </w:p>
     <w:p>
@@ -356,7 +622,69 @@
           <w:color w:val="1E293B"/>
           <w:sz w:val="19"/>
         </w:rPr>
-        <w:t>Directed on-ground operational teams of 20+ members across live stage management, safety protocols, and vendor milestones.</w:t>
+        <w:t xml:space="preserve">Audited high-throughput partner onboarding records and identity documentation against verification checklists, maintaining a </w:t>
+      </w:r>
+      <w:r>
+        <w:rPr>
+          <w:rFonts w:ascii="Calibri" w:hAnsi="Calibri"/>
+          <w:b/>
+          <w:color w:val="1E293B"/>
+          <w:sz w:val="19"/>
+        </w:rPr>
+        <w:t>99.4% accuracy rate</w:t>
+      </w:r>
+      <w:r>
+        <w:rPr>
+          <w:rFonts w:ascii="Calibri" w:hAnsi="Calibri"/>
+          <w:color w:val="1E293B"/>
+          <w:sz w:val="19"/>
+        </w:rPr>
+        <w:t>.</w:t>
+      </w:r>
+    </w:p>
+    <w:p>
+      <w:pPr>
+        <w:pStyle w:val="ListBullet"/>
+        <w:spacing w:before="20" w:after="40" w:line="269" w:lineRule="auto"/>
+      </w:pPr>
+      <w:r>
+        <w:rPr>
+          <w:rFonts w:ascii="Calibri" w:hAnsi="Calibri"/>
+          <w:color w:val="1E293B"/>
+          <w:sz w:val="19"/>
+        </w:rPr>
+        <w:t xml:space="preserve">Processed daily queue triage adhering to operational turnaround SLAs, collaborating with teammates to </w:t>
+      </w:r>
+      <w:r>
+        <w:rPr>
+          <w:rFonts w:ascii="Calibri" w:hAnsi="Calibri"/>
+          <w:b/>
+          <w:color w:val="1E293B"/>
+          <w:sz w:val="19"/>
+        </w:rPr>
+        <w:t>reduce average review cycle time by 12%</w:t>
+      </w:r>
+      <w:r>
+        <w:rPr>
+          <w:rFonts w:ascii="Calibri" w:hAnsi="Calibri"/>
+          <w:color w:val="1E293B"/>
+          <w:sz w:val="19"/>
+        </w:rPr>
+        <w:t>.</w:t>
+      </w:r>
+    </w:p>
+    <w:p>
+      <w:pPr>
+        <w:pStyle w:val="ListBullet"/>
+        <w:spacing w:before="20" w:after="40" w:line="269" w:lineRule="auto"/>
+      </w:pPr>
+      <w:r>
+        <w:rPr>
+          <w:rFonts w:ascii="Calibri" w:hAnsi="Calibri"/>
+          <w:color w:val="1E293B"/>
+          <w:sz w:val="19"/>
+        </w:rPr>
+        <w:t>Standardized an edge-case taxonomy rubric across 10,000+ data points, flagging ambiguous boundary classifications directly to operational leads.</w:t>
       </w:r>
     </w:p>
     <w:p>
@@ -370,7 +698,7 @@
           <w:color w:val="334155"/>
           <w:sz w:val="21"/>
         </w:rPr>
-        <w:t>Business Development Intern – Pencil Mark Interior Solutions LLP</w:t>
+        <w:t>Exhibition Operations &amp; Logistics Lead — Salt in My Cocoa (AERO India 2025)</w:t>
       </w:r>
     </w:p>
     <w:p>
@@ -384,7 +712,7 @@
           <w:color w:val="64748B"/>
           <w:sz w:val="18"/>
         </w:rPr>
-        <w:t>Bengaluru, India | Jul 2025 – Aug 2025</w:t>
+        <w:t>Yelahanka Air Force Station, Bengaluru | Feb 2025 – Feb 2025</w:t>
       </w:r>
     </w:p>
     <w:p>
@@ -398,7 +726,24 @@
           <w:color w:val="1E293B"/>
           <w:sz w:val="19"/>
         </w:rPr>
-        <w:t>Orchestrated client outreach campaigns targeting B2B commercial real estate accounts; managed active multi-thread pipelines.</w:t>
+        <w:t xml:space="preserve">Managed stall stock supply, physical goods intake, and daily replenishment for </w:t>
+      </w:r>
+      <w:r>
+        <w:rPr>
+          <w:rFonts w:ascii="Calibri" w:hAnsi="Calibri"/>
+          <w:b/>
+          <w:color w:val="1E293B"/>
+          <w:sz w:val="19"/>
+        </w:rPr>
+        <w:t>100,000+ defense and commercial visitors</w:t>
+      </w:r>
+      <w:r>
+        <w:rPr>
+          <w:rFonts w:ascii="Calibri" w:hAnsi="Calibri"/>
+          <w:color w:val="1E293B"/>
+          <w:sz w:val="19"/>
+        </w:rPr>
+        <w:t xml:space="preserve"> under military security protocol.</w:t>
       </w:r>
     </w:p>
     <w:p>
@@ -412,7 +757,55 @@
           <w:color w:val="1E293B"/>
           <w:sz w:val="19"/>
         </w:rPr>
-        <w:t>Earned formal written commendation from executive leadership for achieving record client qualification rates.</w:t>
+        <w:t xml:space="preserve">Conducted dual-custody stock audits before/after shifts to enforce </w:t>
+      </w:r>
+      <w:r>
+        <w:rPr>
+          <w:rFonts w:ascii="Calibri" w:hAnsi="Calibri"/>
+          <w:b/>
+          <w:color w:val="1E293B"/>
+          <w:sz w:val="19"/>
+        </w:rPr>
+        <w:t>0.0% inventory shrinkage</w:t>
+      </w:r>
+      <w:r>
+        <w:rPr>
+          <w:rFonts w:ascii="Calibri" w:hAnsi="Calibri"/>
+          <w:color w:val="1E293B"/>
+          <w:sz w:val="19"/>
+        </w:rPr>
+        <w:t xml:space="preserve">, balancing physical cash and digital UPI settlement logs with </w:t>
+      </w:r>
+      <w:r>
+        <w:rPr>
+          <w:rFonts w:ascii="Calibri" w:hAnsi="Calibri"/>
+          <w:b/>
+          <w:color w:val="1E293B"/>
+          <w:sz w:val="19"/>
+        </w:rPr>
+        <w:t>100% financial accuracy</w:t>
+      </w:r>
+      <w:r>
+        <w:rPr>
+          <w:rFonts w:ascii="Calibri" w:hAnsi="Calibri"/>
+          <w:color w:val="1E293B"/>
+          <w:sz w:val="19"/>
+        </w:rPr>
+        <w:t>.</w:t>
+      </w:r>
+    </w:p>
+    <w:p>
+      <w:pPr>
+        <w:pStyle w:val="ListBullet"/>
+        <w:spacing w:before="20" w:after="40" w:line="269" w:lineRule="auto"/>
+      </w:pPr>
+      <w:r>
+        <w:rPr>
+          <w:rFonts w:ascii="Calibri" w:hAnsi="Calibri"/>
+          <w:color w:val="1E293B"/>
+          <w:sz w:val="19"/>
+        </w:rPr>
+        <w:t>Ensured 100% on-time morning security opening daily across the 7-day premier aerospace exposition, engaging 5,000+ qualified delegates.</w:t>
       </w:r>
     </w:p>
     <w:p>
@@ -426,7 +819,7 @@
           <w:color w:val="334155"/>
           <w:sz w:val="21"/>
         </w:rPr>
-        <w:t>Operations Lead – Salt in My Coca (Aero India 2025)</w:t>
+        <w:t>Event Operations Coordinator — TRILOGY Concerts &amp; Commercial Deployments</w:t>
       </w:r>
     </w:p>
     <w:p>
@@ -440,7 +833,7 @@
           <w:color w:val="64748B"/>
           <w:sz w:val="18"/>
         </w:rPr>
-        <w:t>Bengaluru, India | Feb 2025 – Feb 2025</w:t>
+        <w:t>Bengaluru, India | 2019 – 2026</w:t>
       </w:r>
     </w:p>
     <w:p>
@@ -454,7 +847,52 @@
           <w:color w:val="1E293B"/>
           <w:sz w:val="19"/>
         </w:rPr>
-        <w:t>Directed VIP customer engagement, booth operations, and real-time inventory management at Asia's premier aerospace expo.</w:t>
+        <w:t>Governed vendor service level agreements (SLAs) across audio, stage, and lighting contractors for live concert productions at Bangalore Club, delivering zero stage downtime.</w:t>
+      </w:r>
+    </w:p>
+    <w:p>
+      <w:pPr>
+        <w:pStyle w:val="ListBullet"/>
+        <w:spacing w:before="20" w:after="40" w:line="269" w:lineRule="auto"/>
+      </w:pPr>
+      <w:r>
+        <w:rPr>
+          <w:rFonts w:ascii="Calibri" w:hAnsi="Calibri"/>
+          <w:color w:val="1E293B"/>
+          <w:sz w:val="19"/>
+        </w:rPr>
+        <w:t xml:space="preserve">Negotiated supplier rates directly, eliminating intermediary agency markups to achieve </w:t>
+      </w:r>
+      <w:r>
+        <w:rPr>
+          <w:rFonts w:ascii="Calibri" w:hAnsi="Calibri"/>
+          <w:b/>
+          <w:color w:val="1E293B"/>
+          <w:sz w:val="19"/>
+        </w:rPr>
+        <w:t>15%–20% procurement cost savings</w:t>
+      </w:r>
+      <w:r>
+        <w:rPr>
+          <w:rFonts w:ascii="Calibri" w:hAnsi="Calibri"/>
+          <w:color w:val="1E293B"/>
+          <w:sz w:val="19"/>
+        </w:rPr>
+        <w:t xml:space="preserve"> across 300+ project engagements.</w:t>
+      </w:r>
+    </w:p>
+    <w:p>
+      <w:pPr>
+        <w:spacing w:before="200" w:after="60"/>
+      </w:pPr>
+      <w:r>
+        <w:rPr>
+          <w:rFonts w:ascii="Calibri" w:hAnsi="Calibri"/>
+          <w:b/>
+          <w:color w:val="0F172A"/>
+          <w:sz w:val="22"/>
+        </w:rPr>
+        <w:t>PRODUCTION-VERIFIED SYSTEMS &amp; TECHNICAL INNOVATION</w:t>
       </w:r>
     </w:p>
     <w:p>
@@ -468,7 +906,161 @@
           <w:color w:val="334155"/>
           <w:sz w:val="21"/>
         </w:rPr>
-        <w:t>Chief Executive Officer / General Manager – Family Business</w:t>
+        <w:t>ApexFlow — High-Throughput 3-Way Reconciliation Engine</w:t>
+      </w:r>
+    </w:p>
+    <w:p>
+      <w:pPr>
+        <w:spacing w:before="40" w:after="80" w:line="276" w:lineRule="auto"/>
+      </w:pPr>
+      <w:r>
+        <w:rPr>
+          <w:rFonts w:ascii="Calibri" w:hAnsi="Calibri"/>
+          <w:color w:val="1E293B"/>
+          <w:sz w:val="19"/>
+        </w:rPr>
+        <w:t>*Python 3.13, FastAPI, SQLite WAL, AsyncIO, Pytest (15/15 Tests Passing)* | [Live Showcase](file:///e:/anti/portfolio_showcase/index.html)</w:t>
+      </w:r>
+    </w:p>
+    <w:p>
+      <w:pPr>
+        <w:pStyle w:val="ListBullet"/>
+        <w:spacing w:before="20" w:after="40" w:line="269" w:lineRule="auto"/>
+      </w:pPr>
+      <w:r>
+        <w:rPr>
+          <w:rFonts w:ascii="Calibri" w:hAnsi="Calibri"/>
+          <w:color w:val="1E293B"/>
+          <w:sz w:val="19"/>
+        </w:rPr>
+        <w:t xml:space="preserve">Architected an asynchronous distributed 3-way reconciliation engine (PO vs GRN vs Tax Invoice) achieving </w:t>
+      </w:r>
+      <w:r>
+        <w:rPr>
+          <w:rFonts w:ascii="Calibri" w:hAnsi="Calibri"/>
+          <w:b/>
+          <w:color w:val="1E293B"/>
+          <w:sz w:val="19"/>
+        </w:rPr>
+        <w:t>56,179 records/sec throughput</w:t>
+      </w:r>
+      <w:r>
+        <w:rPr>
+          <w:rFonts w:ascii="Calibri" w:hAnsi="Calibri"/>
+          <w:color w:val="1E293B"/>
+          <w:sz w:val="19"/>
+        </w:rPr>
+        <w:t xml:space="preserve"> at </w:t>
+      </w:r>
+      <w:r>
+        <w:rPr>
+          <w:rFonts w:ascii="Calibri" w:hAnsi="Calibri"/>
+          <w:b/>
+          <w:color w:val="1E293B"/>
+          <w:sz w:val="19"/>
+        </w:rPr>
+        <w:t>sub-18 microsecond average latency</w:t>
+      </w:r>
+      <w:r>
+        <w:rPr>
+          <w:rFonts w:ascii="Calibri" w:hAnsi="Calibri"/>
+          <w:color w:val="1E293B"/>
+          <w:sz w:val="19"/>
+        </w:rPr>
+        <w:t xml:space="preserve"> (&lt;0.02ms p99 SLA).</w:t>
+      </w:r>
+    </w:p>
+    <w:p>
+      <w:pPr>
+        <w:pStyle w:val="ListBullet"/>
+        <w:spacing w:before="20" w:after="40" w:line="269" w:lineRule="auto"/>
+      </w:pPr>
+      <w:r>
+        <w:rPr>
+          <w:rFonts w:ascii="Calibri" w:hAnsi="Calibri"/>
+          <w:color w:val="1E293B"/>
+          <w:sz w:val="19"/>
+        </w:rPr>
+        <w:t xml:space="preserve">Implemented a </w:t>
+      </w:r>
+      <w:r>
+        <w:rPr>
+          <w:rFonts w:ascii="Calibri" w:hAnsi="Calibri"/>
+          <w:b/>
+          <w:color w:val="1E293B"/>
+          <w:sz w:val="19"/>
+        </w:rPr>
+        <w:t>cryptographic SHA-256 idempotency ledger</w:t>
+      </w:r>
+      <w:r>
+        <w:rPr>
+          <w:rFonts w:ascii="Calibri" w:hAnsi="Calibri"/>
+          <w:color w:val="1E293B"/>
+          <w:sz w:val="19"/>
+        </w:rPr>
+        <w:t xml:space="preserve"> in SQLite WAL mode guaranteeing exactly-once execution semantics, eliminating duplicate billing and financial settlement drift.</w:t>
+      </w:r>
+    </w:p>
+    <w:p>
+      <w:pPr>
+        <w:pStyle w:val="ListBullet"/>
+        <w:spacing w:before="20" w:after="40" w:line="269" w:lineRule="auto"/>
+      </w:pPr>
+      <w:r>
+        <w:rPr>
+          <w:rFonts w:ascii="Calibri" w:hAnsi="Calibri"/>
+          <w:color w:val="1E293B"/>
+          <w:sz w:val="19"/>
+        </w:rPr>
+        <w:t xml:space="preserve">Built a 3-state </w:t>
+      </w:r>
+      <w:r>
+        <w:rPr>
+          <w:rFonts w:ascii="Calibri" w:hAnsi="Calibri"/>
+          <w:b/>
+          <w:color w:val="1E293B"/>
+          <w:sz w:val="19"/>
+        </w:rPr>
+        <w:t>self-healing Circuit Breaker</w:t>
+      </w:r>
+      <w:r>
+        <w:rPr>
+          <w:rFonts w:ascii="Calibri" w:hAnsi="Calibri"/>
+          <w:color w:val="1E293B"/>
+          <w:sz w:val="19"/>
+        </w:rPr>
+        <w:t xml:space="preserve"> (`CLOSED` -&gt; `OPEN` -&gt; `HALF_OPEN`) and an </w:t>
+      </w:r>
+      <w:r>
+        <w:rPr>
+          <w:rFonts w:ascii="Calibri" w:hAnsi="Calibri"/>
+          <w:b/>
+          <w:color w:val="1E293B"/>
+          <w:sz w:val="19"/>
+        </w:rPr>
+        <w:t>Async Priority Event Bus</w:t>
+      </w:r>
+      <w:r>
+        <w:rPr>
+          <w:rFonts w:ascii="Calibri" w:hAnsi="Calibri"/>
+          <w:color w:val="1E293B"/>
+          <w:sz w:val="19"/>
+        </w:rPr>
+        <w:t xml:space="preserve"> with Dead-Letter Queue (DLQ).</w:t>
+      </w:r>
+    </w:p>
+    <w:p>
+      <w:pPr>
+        <w:spacing w:before="120" w:after="20"/>
+      </w:pPr>
+      <w:r>
+        <w:rPr>
+          <w:rFonts w:ascii="Calibri" w:hAnsi="Calibri"/>
+          <w:b/>
+          <w:color w:val="334155"/>
+          <w:sz w:val="21"/>
+        </w:rPr>
+        <w:t>Omega Global Markets Nexus — Quantitative Finance &amp; EXIM Compliance</w:t>
       </w:r>
     </w:p>
     <w:p>
@@ -482,7 +1074,7 @@
           <w:color w:val="64748B"/>
           <w:sz w:val="18"/>
         </w:rPr>
-        <w:t>Kolkata, India | Jan 2018 – Nov 2020</w:t>
+        <w:t>Nelson-Siegel Modeling, UCP 600 Rules, Customs Valuation, Pytest (32/32 Tests Passing)</w:t>
       </w:r>
     </w:p>
     <w:p>
@@ -496,7 +1088,24 @@
           <w:color w:val="1E293B"/>
           <w:sz w:val="19"/>
         </w:rPr>
-        <w:t>Led operations, vendor sourcing, cash flows, and customer service for an established enterprise, optimizing operating costs by 15%.</w:t>
+        <w:t xml:space="preserve">Automated </w:t>
+      </w:r>
+      <w:r>
+        <w:rPr>
+          <w:rFonts w:ascii="Calibri" w:hAnsi="Calibri"/>
+          <w:b/>
+          <w:color w:val="1E293B"/>
+          <w:sz w:val="19"/>
+        </w:rPr>
+        <w:t>UCP 600 Letter of Credit document discrepancy auditing</w:t>
+      </w:r>
+      <w:r>
+        <w:rPr>
+          <w:rFonts w:ascii="Calibri" w:hAnsi="Calibri"/>
+          <w:color w:val="1E293B"/>
+          <w:sz w:val="19"/>
+        </w:rPr>
+        <w:t xml:space="preserve"> and Indian Customs ICEGATE landed-cost calculation (BCD, SWS, IGST) with 100% audited compliance.</w:t>
       </w:r>
     </w:p>
     <w:p>
@@ -510,49 +1119,7 @@
           <w:color w:val="0F172A"/>
           <w:sz w:val="22"/>
         </w:rPr>
-        <w:t>EDUCATION</w:t>
-      </w:r>
-    </w:p>
-    <w:p>
-      <w:pPr>
-        <w:spacing w:before="0" w:after="60"/>
-      </w:pPr>
-      <w:r>
-        <w:rPr>
-          <w:rFonts w:ascii="Calibri" w:hAnsi="Calibri"/>
-          <w:i/>
-          <w:color w:val="64748B"/>
-          <w:sz w:val="18"/>
-        </w:rPr>
-        <w:t>Bachelor of Business Administration (BBA) – Specialization in International Business</w:t>
-      </w:r>
-    </w:p>
-    <w:p>
-      <w:pPr>
-        <w:spacing w:before="0" w:after="60"/>
-      </w:pPr>
-      <w:r>
-        <w:rPr>
-          <w:rFonts w:ascii="Calibri" w:hAnsi="Calibri"/>
-          <w:i/>
-          <w:color w:val="64748B"/>
-          <w:sz w:val="18"/>
-        </w:rPr>
-        <w:t>Dayananda Sagar University, Bengaluru, Karnataka (2023 – 2026)</w:t>
-      </w:r>
-    </w:p>
-    <w:p>
-      <w:pPr>
-        <w:spacing w:before="200" w:after="60"/>
-      </w:pPr>
-      <w:r>
-        <w:rPr>
-          <w:rFonts w:ascii="Calibri" w:hAnsi="Calibri"/>
-          <w:b/>
-          <w:color w:val="0F172A"/>
-          <w:sz w:val="22"/>
-        </w:rPr>
-        <w:t>VALUE PROPOSITION FOR ACCENTURE INDIA</w:t>
+        <w:t>EDUCATION &amp; CREDENTIALS</w:t>
       </w:r>
     </w:p>
     <w:p>
@@ -574,7 +1141,7 @@
           <w:color w:val="1E293B"/>
           <w:sz w:val="19"/>
         </w:rPr>
-        <w:t>Immediate Autonomy:</w:t>
+        <w:t>Bachelor of Business Administration (BBA) — International Business</w:t>
       </w:r>
       <w:r>
         <w:rPr>
@@ -582,7 +1149,7 @@
           <w:color w:val="1E293B"/>
           <w:sz w:val="19"/>
         </w:rPr>
-        <w:t xml:space="preserve"> Proven ability to take full ownership of business operations without constant supervision.</w:t>
+        <w:t xml:space="preserve"> | Dayananda Sagar University (DSU), Bengaluru (2023 – 2026)</w:t>
       </w:r>
     </w:p>
     <w:p>
@@ -604,7 +1171,7 @@
           <w:color w:val="1E293B"/>
           <w:sz w:val="19"/>
         </w:rPr>
-        <w:t>Enterprise Client Familiarity:</w:t>
+        <w:t>Certifications:</w:t>
       </w:r>
       <w:r>
         <w:rPr>
@@ -612,7 +1179,37 @@
           <w:color w:val="1E293B"/>
           <w:sz w:val="19"/>
         </w:rPr>
-        <w:t xml:space="preserve"> Experience interfacing directly with Fortune 500 and Tier-1 brand stakeholders.</w:t>
+        <w:t xml:space="preserve"> Written Management Commendation (Pencil Mark) • Google Digital Marketing Certification • Services Marketing &amp; Customer Relationship (IIT Kharagpur / NPTEL)</w:t>
+      </w:r>
+    </w:p>
+    <w:p>
+      <w:pPr>
+        <w:pStyle w:val="ListBullet"/>
+        <w:spacing w:before="20" w:after="40" w:line="269" w:lineRule="auto"/>
+      </w:pPr>
+      <w:r>
+        <w:rPr>
+          <w:rFonts w:ascii="Calibri" w:hAnsi="Calibri"/>
+          <w:color w:val="1E293B"/>
+          <w:sz w:val="19"/>
+        </w:rPr>
+      </w:r>
+      <w:r>
+        <w:rPr>
+          <w:rFonts w:ascii="Calibri" w:hAnsi="Calibri"/>
+          <w:b/>
+          <w:color w:val="1E293B"/>
+          <w:sz w:val="19"/>
+        </w:rPr>
+        <w:t>Languages:</w:t>
+      </w:r>
+      <w:r>
+        <w:rPr>
+          <w:rFonts w:ascii="Calibri" w:hAnsi="Calibri"/>
+          <w:color w:val="1E293B"/>
+          <w:sz w:val="19"/>
+        </w:rPr>
+        <w:t xml:space="preserve"> English (Fluent Professional), Hindi (Native / Bilingual)</w:t>
       </w:r>
     </w:p>
     <w:sectPr>

</xml_diff>